<commit_message>
docs(tesis): H1b contrastada contra el FMI (3%) y escenario base del FMI CR 25/95
Co-Authored-By: Claude Opus 5.5 <noreply@anthropic.com>
</commit_message>
<xml_diff>
--- a/tesis_oficial_borradores/para_el_grupo/Introduccion_y_Antecedentes_v3.docx
+++ b/tesis_oficial_borradores/para_el_grupo/Introduccion_y_Antecedentes_v3.docx
@@ -247,7 +247,7 @@
         <w:pStyle w:val="BodyText"/>
       </w:pPr>
       <w:r>
-        <w:t xml:space="preserve">H1b. En el escenario base, la probabilidad de que la deuda consolidada no se estabilice hacia el final del horizonte de proyección supera el 50%. La métrica es la que el FMI utiliza en su marco de riesgo soberano (FMI, 2021), y el corte del 50% equivale a afirmar que la trayectoria mediana de la distribución simulada no se estabiliza (la justificación se desarrolla en el Capítulo 4).</w:t>
+        <w:t xml:space="preserve">H1b. La probabilidad de que la deuda consolidada no se estabilice hacia el final del horizonte de proyección, estimada con shocks estructuralmente identificados, es mayor que la que el FMI reporta para la deuda federal bruta en su análisis de 2025, de alrededor de 3% (FMI, 2025, anexo II). Para que la comparación sea válida, el escenario base de la simulación reproduce los supuestos del escenario base del FMI.</w:t>
       </w:r>
     </w:p>
     <w:p>
@@ -1619,34 +1619,6 @@
         </w:numPr>
       </w:pPr>
       <w:r>
-        <w:t xml:space="preserve">Hastie, T., Tibshirani, R., y Friedman, J. (2009).</w:t>
-      </w:r>
-      <w:r>
-        <w:t xml:space="preserve"> </w:t>
-      </w:r>
-      <w:r>
-        <w:rPr>
-          <w:i/>
-          <w:iCs/>
-        </w:rPr>
-        <w:t xml:space="preserve">The elements of statistical learning</w:t>
-      </w:r>
-      <w:r>
-        <w:t xml:space="preserve"> </w:t>
-      </w:r>
-      <w:r>
-        <w:t xml:space="preserve">(2.ª ed.). Springer.</w:t>
-      </w:r>
-    </w:p>
-    <w:p>
-      <w:pPr>
-        <w:pStyle w:val="Compact"/>
-        <w:numPr>
-          <w:ilvl w:val="0"/>
-          <w:numId w:val="1002"/>
-        </w:numPr>
-      </w:pPr>
-      <w:r>
         <w:t xml:space="preserve">Hébert, B., y Schreger, J. (2017). The costs of sovereign default: Evidence from Argentina.</w:t>
       </w:r>
       <w:r>
@@ -2185,7 +2157,7 @@
       </w:r>
     </w:p>
     <w:bookmarkEnd w:id="33"/>
-    <w:bookmarkStart w:id="39" w:name="X94fa00cbba88d80644c76c995e4abd03512405e"/>
+    <w:bookmarkStart w:id="38" w:name="X94fa00cbba88d80644c76c995e4abd03512405e"/>
     <w:p>
       <w:pPr>
         <w:pStyle w:val="Heading1"/>
@@ -2194,13 +2166,13 @@
         <w:t xml:space="preserve">Notas para el grupo (no forman parte del texto de la tesis)</w:t>
       </w:r>
     </w:p>
-    <w:bookmarkStart w:id="34" w:name="X3df75d651ef1940a8b8f22e6014631654d3e841"/>
+    <w:bookmarkStart w:id="34" w:name="X28ba9501ac41b1fea27c299c39d93c8cc47c96f"/>
     <w:p>
       <w:pPr>
         <w:pStyle w:val="Heading2"/>
       </w:pPr>
       <w:r>
-        <w:t xml:space="preserve">Nota 1. Justificación del criterio de H1b</w:t>
+        <w:t xml:space="preserve">Nota 1. Criterio de H1b (decidido el 10/10/2026)</w:t>
       </w:r>
     </w:p>
     <w:p>
@@ -2218,7 +2190,7 @@
         <w:t xml:space="preserve"> </w:t>
       </w:r>
       <w:r>
-        <w:t xml:space="preserve">La probabilidad de que la deuda no se estabilice: la proporción de trayectorias simuladas en las que el resultado primario al final del horizonte es menor que el necesario para estabilizar la deuda. Es la primera de las tres métricas del gráfico de abanico del FMI (FMI, 2021, párr. 53). La no estabilización de la deuda es además uno de los tres conceptos centrales que distingue el marco (FMI, 2021, recuadro 2).</w:t>
+        <w:t xml:space="preserve">La probabilidad de que la deuda no se estabilice: la proporción de trayectorias simuladas en las que el resultado primario al final del horizonte es menor que el necesario para estabilizar la deuda. Es la primera de las tres métricas del gráfico de abanico del FMI (FMI, 2021, párr. 53), y la no estabilización es uno de los tres conceptos centrales del marco (FMI, 2021, recuadro 2).</w:t>
       </w:r>
     </w:p>
     <w:p>
@@ -2230,79 +2202,111 @@
           <w:b/>
           <w:bCs/>
         </w:rPr>
-        <w:t xml:space="preserve">El corte del 50%.</w:t>
-      </w:r>
-      <w:r>
-        <w:t xml:space="preserve"> </w:t>
-      </w:r>
-      <w:r>
-        <w:t xml:space="preserve">Se justifica por tres razones:</w:t>
-      </w:r>
-    </w:p>
-    <w:p>
-      <w:pPr>
-        <w:pStyle w:val="Compact"/>
-        <w:numPr>
-          <w:ilvl w:val="0"/>
-          <w:numId w:val="1003"/>
-        </w:numPr>
+        <w:t xml:space="preserve">El umbral: el propio resultado del FMI.</w:t>
+      </w:r>
+      <w:r>
+        <w:t xml:space="preserve"> </w:t>
+      </w:r>
+      <w:r>
+        <w:t xml:space="preserve">El FMI estimó para Argentina una probabilidad de estabilización de alrededor de 97% a mediano plazo y en su abanico a 2034 (FMI, 2025, anexo II, párrs. 6 y 8). La probabilidad de no estabilización es, entonces, de alrededor de 3%. H1b sostiene que nuestra estimación supera ese valor. El umbral no es una elección nuestra: es el diagnóstico oficial vigente. La hipótesis mide si las dos diferencias de esta tesis respecto del FMI (perímetro consolidado y shocks identificados con su dinámica) cambian ese diagnóstico, que es exactamente lo que plantea la vacancia.</w:t>
+      </w:r>
+    </w:p>
+    <w:p>
+      <w:pPr>
+        <w:pStyle w:val="BodyText"/>
       </w:pPr>
       <w:r>
         <w:rPr>
           <w:b/>
           <w:bCs/>
         </w:rPr>
-        <w:t xml:space="preserve">Equivalencia con la mediana.</w:t>
-      </w:r>
-      <w:r>
-        <w:t xml:space="preserve"> </w:t>
-      </w:r>
-      <w:r>
-        <w:t xml:space="preserve">Si X es la diferencia entre el resultado primario proyectado y el que estabiliza la deuda, P(X &lt; 0) &gt; 0,5 si y solo si la mediana de X es negativa. Afirmar que la probabilidad supera el 50% equivale a afirmar que la trayectoria central de la simulación no estabiliza la deuda.</w:t>
-      </w:r>
-    </w:p>
-    <w:p>
-      <w:pPr>
-        <w:pStyle w:val="Compact"/>
-        <w:numPr>
-          <w:ilvl w:val="0"/>
-          <w:numId w:val="1003"/>
-        </w:numPr>
+        <w:t xml:space="preserve">Cómo se contrasta.</w:t>
+      </w:r>
+      <w:r>
+        <w:t xml:space="preserve"> </w:t>
+      </w:r>
+      <w:r>
+        <w:t xml:space="preserve">La probabilidad estimada tiene incertidumbre, que viene del muestreo de las trayectorias y de los parámetros estimados del SVARX. Se calcula su intervalo de confianza con</w:t>
+      </w:r>
+      <w:r>
+        <w:t xml:space="preserve"> </w:t>
+      </w:r>
+      <w:r>
+        <w:rPr>
+          <w:i/>
+          <w:iCs/>
+        </w:rPr>
+        <w:t xml:space="preserve">bootstrap</w:t>
+      </w:r>
+      <w:r>
+        <w:t xml:space="preserve"> </w:t>
+      </w:r>
+      <w:r>
+        <w:t xml:space="preserve">de los parámetros. H1b se considera respaldada si el límite inferior del intervalo de 90% supera el 3%, lo que equivale a un contraste unilateral al 5%, la convención estándar de significatividad.</w:t>
+      </w:r>
+    </w:p>
+    <w:p>
+      <w:pPr>
+        <w:pStyle w:val="BodyText"/>
       </w:pPr>
       <w:r>
         <w:rPr>
           <w:b/>
           <w:bCs/>
         </w:rPr>
-        <w:t xml:space="preserve">Regla de decisión estándar.</w:t>
-      </w:r>
-      <w:r>
-        <w:t xml:space="preserve"> </w:t>
-      </w:r>
-      <w:r>
-        <w:t xml:space="preserve">Con costos simétricos de error, la regla que minimiza el error esperado elige el estado más probable, lo que equivale a un corte de 0,5 (clasificador de Bayes; Hastie, Tibshirani y Friedman, 2009, sección 2.4). [VERIFICAR la sección.]</w:t>
-      </w:r>
-    </w:p>
-    <w:p>
-      <w:pPr>
-        <w:pStyle w:val="Compact"/>
-        <w:numPr>
-          <w:ilvl w:val="0"/>
-          <w:numId w:val="1003"/>
-        </w:numPr>
+        <w:t xml:space="preserve">Condiciones de comparabilidad.</w:t>
+      </w:r>
+      <w:r>
+        <w:t xml:space="preserve"> </w:t>
+      </w:r>
+      <w:r>
+        <w:t xml:space="preserve">El escenario base de la simulación reproduce los senderos del FMI: crecimiento, resultado primario y tasas, tomados de FMI (2025). Se reporta también el resultado con la deuda federal bruta, el perímetro del FMI, para separar cuánto de la diferencia viene del perímetro y cuánto de los shocks.</w:t>
+      </w:r>
+    </w:p>
+    <w:p>
+      <w:pPr>
+        <w:pStyle w:val="BodyText"/>
       </w:pPr>
       <w:r>
         <w:rPr>
           <w:b/>
           <w:bCs/>
         </w:rPr>
-        <w:t xml:space="preserve">El corte calibrado del FMI no es replicable con un solo país.</w:t>
-      </w:r>
-      <w:r>
-        <w:t xml:space="preserve"> </w:t>
-      </w:r>
-      <w:r>
-        <w:t xml:space="preserve">Los cortes del índice compuesto del FMI (1,13 y 2,08) se calibraron sobre un panel de crisis y requieren un índice institucional que no está publicado (FMI y ESM, 2023, diapositiva 31).</w:t>
+        <w:t xml:space="preserve">Por qué no el 50%.</w:t>
+      </w:r>
+      <w:r>
+        <w:t xml:space="preserve"> </w:t>
+      </w:r>
+      <w:r>
+        <w:t xml:space="preserve">El corte del 50% (equivalente a que la trayectoria mediana no se estabilice) era defendible, pero con un 97% de estabilización estimado por el FMI el resultado quedaba prácticamente determinado de antemano y no informaba nada sobre la vacancia. Se lo conserva solo como dato descriptivo.</w:t>
+      </w:r>
+    </w:p>
+    <w:bookmarkEnd w:id="34"/>
+    <w:bookmarkStart w:id="35" w:name="X6e923efd645ab780f33626d97e87b3009ff5b88"/>
+    <w:p>
+      <w:pPr>
+        <w:pStyle w:val="Heading2"/>
+      </w:pPr>
+      <w:r>
+        <w:t xml:space="preserve">Nota 2. Tamaño del shock de la FED (pendiente)</w:t>
+      </w:r>
+    </w:p>
+    <w:p>
+      <w:pPr>
+        <w:pStyle w:val="FirstParagraph"/>
+      </w:pPr>
+      <w:r>
+        <w:t xml:space="preserve">Los +100 puntos básicos de la versión anterior no estaban justificados y se sacaron. Hay dos criterios defendibles: un desvío estándar de la variación trimestral de la tasa sombra de la FED en 1996-2025, que es la convención de la literatura de VAR, o un episodio histórico como el ciclo de subas de 2022-2023. Se decide con la serie construida.</w:t>
+      </w:r>
+    </w:p>
+    <w:bookmarkEnd w:id="35"/>
+    <w:bookmarkStart w:id="36" w:name="X73c46a59ea692b6fb8fe2ed0b01725fbf578251"/>
+    <w:p>
+      <w:pPr>
+        <w:pStyle w:val="Heading2"/>
+      </w:pPr>
+      <w:r>
+        <w:t xml:space="preserve">Nota 3. Cambios respecto del texto de Santiago</w:t>
       </w:r>
     </w:p>
     <w:p>
@@ -2314,166 +2318,150 @@
           <w:b/>
           <w:bCs/>
         </w:rPr>
-        <w:t xml:space="preserve">Blindaje.</w:t>
-      </w:r>
-      <w:r>
-        <w:t xml:space="preserve"> </w:t>
-      </w:r>
-      <w:r>
-        <w:t xml:space="preserve">Se reporta la probabilidad completa y el ancho del abanico entre los percentiles 5 y 95, y se muestra a partir de qué corte cambiaría la conclusión.</w:t>
-      </w:r>
-    </w:p>
-    <w:bookmarkEnd w:id="34"/>
-    <w:bookmarkStart w:id="35" w:name="X7b46dba93c0f787b157470c5ad6078b1cb6de62"/>
-    <w:p>
-      <w:pPr>
-        <w:pStyle w:val="Heading2"/>
-      </w:pPr>
-      <w:r>
-        <w:t xml:space="preserve">Nota 2. Dato nuevo del FMI que conviene discutir antes de cerrar H1b</w:t>
-      </w:r>
-    </w:p>
-    <w:p>
-      <w:pPr>
-        <w:pStyle w:val="FirstParagraph"/>
-      </w:pPr>
-      <w:r>
-        <w:t xml:space="preserve">El FMI estimó para Argentina, en abril de 2025, una probabilidad de estabilización de la deuda de alrededor de 97%, tanto a mediano plazo como en un abanico a 2034 (FMI, 2025, anexo II, párrs. 6 y 8). Es decir, una probabilidad de no estabilización cercana al 3%, sobre la deuda federal bruta y con shocks no identificados.</w:t>
-      </w:r>
-    </w:p>
-    <w:p>
-      <w:pPr>
-        <w:pStyle w:val="BodyText"/>
-      </w:pPr>
-      <w:r>
-        <w:t xml:space="preserve">Esto abre una alternativa para H1b que puede ser mejor que el corte del 50%:</w:t>
-      </w:r>
-      <w:r>
-        <w:t xml:space="preserve"> </w:t>
-      </w:r>
+        <w:t xml:space="preserve">Introducción:</w:t>
+      </w:r>
+    </w:p>
+    <w:p>
+      <w:pPr>
+        <w:pStyle w:val="Compact"/>
+        <w:numPr>
+          <w:ilvl w:val="0"/>
+          <w:numId w:val="1003"/>
+        </w:numPr>
+      </w:pPr>
       <w:r>
         <w:rPr>
           <w:b/>
           <w:bCs/>
         </w:rPr>
-        <w:t xml:space="preserve">contrastar contra el número del FMI.</w:t>
-      </w:r>
-      <w:r>
-        <w:t xml:space="preserve"> </w:t>
-      </w:r>
-      <w:r>
-        <w:t xml:space="preserve">Por ejemplo:</w:t>
-      </w:r>
-      <w:r>
-        <w:t xml:space="preserve"> </w:t>
-      </w:r>
-      <w:r>
-        <w:t xml:space="preserve">“La probabilidad de no estabilización de la deuda consolidada, estimada con shocks estructuralmente identificados, es mayor que la que reporta el FMI para la deuda federal bruta (cerca de 3%)”</w:t>
-      </w:r>
-      <w:r>
-        <w:t xml:space="preserve">. Tiene tres ventajas:</w:t>
-      </w:r>
-    </w:p>
-    <w:p>
-      <w:pPr>
-        <w:pStyle w:val="Compact"/>
-        <w:numPr>
-          <w:ilvl w:val="0"/>
-          <w:numId w:val="1004"/>
-        </w:numPr>
-      </w:pPr>
-      <w:r>
-        <w:t xml:space="preserve">El umbral sale de una fuente oficial y no de una regla general.</w:t>
-      </w:r>
-    </w:p>
-    <w:p>
-      <w:pPr>
-        <w:pStyle w:val="Compact"/>
-        <w:numPr>
-          <w:ilvl w:val="0"/>
-          <w:numId w:val="1004"/>
-        </w:numPr>
-      </w:pPr>
-      <w:r>
-        <w:t xml:space="preserve">Conecta la hipótesis directamente con la vacancia, porque mide si el perímetro consolidado y los shocks identificados cambian el diagnóstico del FMI.</w:t>
-      </w:r>
-    </w:p>
-    <w:p>
-      <w:pPr>
-        <w:pStyle w:val="Compact"/>
-        <w:numPr>
-          <w:ilvl w:val="0"/>
-          <w:numId w:val="1004"/>
-        </w:numPr>
-      </w:pPr>
-      <w:r>
-        <w:t xml:space="preserve">Es mucho más probable que tenga un resultado informativo. Con un corte del 50%, si el FMI da 97% de estabilización, H1b casi seguro se rechaza.</w:t>
-      </w:r>
-    </w:p>
-    <w:p>
-      <w:pPr>
-        <w:pStyle w:val="FirstParagraph"/>
-      </w:pPr>
-      <w:r>
-        <w:t xml:space="preserve">La desventaja es que la comparación no es exacta: el escenario base del FMI incorpora los supuestos de política del programa. Hay que usar el mismo escenario base, o explicar la diferencia.</w:t>
-      </w:r>
-      <w:r>
-        <w:t xml:space="preserve"> </w:t>
-      </w:r>
+        <w:t xml:space="preserve">Coyuntura actualizada:</w:t>
+      </w:r>
+      <w:r>
+        <w:t xml:space="preserve"> </w:t>
+      </w:r>
+      <w:r>
+        <w:t xml:space="preserve">“administración ingresante”</w:t>
+      </w:r>
+      <w:r>
+        <w:t xml:space="preserve"> </w:t>
+      </w:r>
+      <w:r>
+        <w:t xml:space="preserve">pasó a</w:t>
+      </w:r>
+      <w:r>
+        <w:t xml:space="preserve"> </w:t>
+      </w:r>
+      <w:r>
+        <w:t xml:space="preserve">“la que asumió en diciembre de 2023”</w:t>
+      </w:r>
+      <w:r>
+        <w:t xml:space="preserve">, y se usan datos de la OPC de julio de 2026.</w:t>
+      </w:r>
+    </w:p>
+    <w:p>
+      <w:pPr>
+        <w:pStyle w:val="Compact"/>
+        <w:numPr>
+          <w:ilvl w:val="0"/>
+          <w:numId w:val="1003"/>
+        </w:numPr>
+      </w:pPr>
       <w:r>
         <w:rPr>
           <w:b/>
           <w:bCs/>
         </w:rPr>
-        <w:t xml:space="preserve">Decidir en el grupo.</w:t>
-      </w:r>
-    </w:p>
-    <w:bookmarkEnd w:id="35"/>
-    <w:bookmarkStart w:id="36" w:name="X11e66d3a982dd3b3472471caeb818aa3f8bf4b7"/>
-    <w:p>
-      <w:pPr>
-        <w:pStyle w:val="Heading2"/>
-      </w:pPr>
-      <w:r>
-        <w:t xml:space="preserve">Nota 3. Tamaño del shock de la FED (pendiente)</w:t>
-      </w:r>
-    </w:p>
-    <w:p>
-      <w:pPr>
-        <w:pStyle w:val="FirstParagraph"/>
-      </w:pPr>
-      <w:r>
-        <w:t xml:space="preserve">Los +100 puntos básicos de la versión anterior no estaban justificados y se sacaron. Hay dos criterios defendibles: un desvío estándar de la variación trimestral de la tasa sombra de la FED en 1996-2025, que es la convención de la literatura de VAR, o un episodio histórico como el ciclo de subas de 2022-2023. Se decide con la serie construida.</w:t>
-      </w:r>
-    </w:p>
-    <w:bookmarkEnd w:id="36"/>
-    <w:bookmarkStart w:id="37" w:name="X2cff6b1868df304be9b72ed4e5d5e3de2a6a214"/>
-    <w:p>
-      <w:pPr>
-        <w:pStyle w:val="Heading2"/>
-      </w:pPr>
-      <w:r>
-        <w:t xml:space="preserve">Nota 4. Cambios respecto del texto de Santiago</w:t>
-      </w:r>
-    </w:p>
-    <w:p>
-      <w:pPr>
-        <w:pStyle w:val="FirstParagraph"/>
+        <w:t xml:space="preserve">Citas corregidas:</w:t>
+      </w:r>
+    </w:p>
+    <w:p>
+      <w:pPr>
+        <w:pStyle w:val="Compact"/>
+        <w:numPr>
+          <w:ilvl w:val="1"/>
+          <w:numId w:val="1004"/>
+        </w:numPr>
+      </w:pPr>
+      <w:r>
+        <w:t xml:space="preserve">Reinhart et al. (2003) se usa ahora para la intolerancia a la deuda.</w:t>
+      </w:r>
+    </w:p>
+    <w:p>
+      <w:pPr>
+        <w:pStyle w:val="Compact"/>
+        <w:numPr>
+          <w:ilvl w:val="1"/>
+          <w:numId w:val="1004"/>
+        </w:numPr>
+      </w:pPr>
+      <w:r>
+        <w:t xml:space="preserve">Mendoza y Oviedo (2007), para la incertidumbre y el límite de deuda.</w:t>
+      </w:r>
+    </w:p>
+    <w:p>
+      <w:pPr>
+        <w:pStyle w:val="Compact"/>
+        <w:numPr>
+          <w:ilvl w:val="1"/>
+          <w:numId w:val="1004"/>
+        </w:numPr>
+      </w:pPr>
+      <w:r>
+        <w:t xml:space="preserve">La fatiga fiscal pasa a Ghosh et al. (2013).</w:t>
+      </w:r>
+    </w:p>
+    <w:p>
+      <w:pPr>
+        <w:pStyle w:val="Compact"/>
+        <w:numPr>
+          <w:ilvl w:val="1"/>
+          <w:numId w:val="1004"/>
+        </w:numPr>
+      </w:pPr>
+      <w:r>
+        <w:t xml:space="preserve">Ando et al. queda con año 2025.</w:t>
+      </w:r>
+    </w:p>
+    <w:p>
+      <w:pPr>
+        <w:pStyle w:val="Compact"/>
+        <w:numPr>
+          <w:ilvl w:val="1"/>
+          <w:numId w:val="1004"/>
+        </w:numPr>
+      </w:pPr>
+      <w:r>
+        <w:t xml:space="preserve">Se sacan Garud y la tesis propia.</w:t>
+      </w:r>
+    </w:p>
+    <w:p>
+      <w:pPr>
+        <w:pStyle w:val="Compact"/>
+        <w:numPr>
+          <w:ilvl w:val="0"/>
+          <w:numId w:val="1003"/>
+        </w:numPr>
       </w:pPr>
       <w:r>
         <w:rPr>
           <w:b/>
           <w:bCs/>
         </w:rPr>
-        <w:t xml:space="preserve">Introducción:</w:t>
-      </w:r>
-    </w:p>
-    <w:p>
-      <w:pPr>
-        <w:pStyle w:val="Compact"/>
-        <w:numPr>
-          <w:ilvl w:val="0"/>
-          <w:numId w:val="1005"/>
+        <w:t xml:space="preserve">Canal cuasifiscal del shock de la FED:</w:t>
+      </w:r>
+      <w:r>
+        <w:t xml:space="preserve"> </w:t>
+      </w:r>
+      <w:r>
+        <w:t xml:space="preserve">se redacta en pasado.</w:t>
+      </w:r>
+    </w:p>
+    <w:p>
+      <w:pPr>
+        <w:pStyle w:val="Compact"/>
+        <w:numPr>
+          <w:ilvl w:val="0"/>
+          <w:numId w:val="1003"/>
         </w:numPr>
       </w:pPr>
       <w:r>
@@ -2481,36 +2469,21 @@
           <w:b/>
           <w:bCs/>
         </w:rPr>
-        <w:t xml:space="preserve">Coyuntura actualizada:</w:t>
-      </w:r>
-      <w:r>
-        <w:t xml:space="preserve"> </w:t>
-      </w:r>
-      <w:r>
-        <w:t xml:space="preserve">“administración ingresante”</w:t>
-      </w:r>
-      <w:r>
-        <w:t xml:space="preserve"> </w:t>
-      </w:r>
-      <w:r>
-        <w:t xml:space="preserve">pasó a</w:t>
-      </w:r>
-      <w:r>
-        <w:t xml:space="preserve"> </w:t>
-      </w:r>
-      <w:r>
-        <w:t xml:space="preserve">“la que asumió en diciembre de 2023”</w:t>
-      </w:r>
-      <w:r>
-        <w:t xml:space="preserve">, y se usan datos de la OPC de julio de 2026.</w:t>
-      </w:r>
-    </w:p>
-    <w:p>
-      <w:pPr>
-        <w:pStyle w:val="Compact"/>
-        <w:numPr>
-          <w:ilvl w:val="0"/>
-          <w:numId w:val="1005"/>
+        <w:t xml:space="preserve">Pregunta e hipótesis:</w:t>
+      </w:r>
+      <w:r>
+        <w:t xml:space="preserve"> </w:t>
+      </w:r>
+      <w:r>
+        <w:t xml:space="preserve">se acorta la pregunta, se agregan seis objetivos específicos y H1a pasa a ser contrastable.</w:t>
+      </w:r>
+    </w:p>
+    <w:p>
+      <w:pPr>
+        <w:pStyle w:val="Compact"/>
+        <w:numPr>
+          <w:ilvl w:val="0"/>
+          <w:numId w:val="1003"/>
         </w:numPr>
       </w:pPr>
       <w:r>
@@ -2518,89 +2491,25 @@
           <w:b/>
           <w:bCs/>
         </w:rPr>
-        <w:t xml:space="preserve">Citas corregidas:</w:t>
-      </w:r>
-    </w:p>
-    <w:p>
-      <w:pPr>
-        <w:pStyle w:val="Compact"/>
-        <w:numPr>
-          <w:ilvl w:val="1"/>
-          <w:numId w:val="1006"/>
-        </w:numPr>
-      </w:pPr>
-      <w:r>
-        <w:t xml:space="preserve">Reinhart et al. (2003) se usa ahora para la intolerancia a la deuda.</w:t>
-      </w:r>
-    </w:p>
-    <w:p>
-      <w:pPr>
-        <w:pStyle w:val="Compact"/>
-        <w:numPr>
-          <w:ilvl w:val="1"/>
-          <w:numId w:val="1006"/>
-        </w:numPr>
-      </w:pPr>
-      <w:r>
-        <w:t xml:space="preserve">Mendoza y Oviedo (2007), para la incertidumbre y el límite de deuda.</w:t>
-      </w:r>
-    </w:p>
-    <w:p>
-      <w:pPr>
-        <w:pStyle w:val="Compact"/>
-        <w:numPr>
-          <w:ilvl w:val="1"/>
-          <w:numId w:val="1006"/>
-        </w:numPr>
-      </w:pPr>
-      <w:r>
-        <w:t xml:space="preserve">La fatiga fiscal pasa a Ghosh et al. (2013).</w:t>
-      </w:r>
-    </w:p>
-    <w:p>
-      <w:pPr>
-        <w:pStyle w:val="Compact"/>
-        <w:numPr>
-          <w:ilvl w:val="1"/>
-          <w:numId w:val="1006"/>
-        </w:numPr>
-      </w:pPr>
-      <w:r>
-        <w:t xml:space="preserve">Ando et al. queda con año 2025.</w:t>
-      </w:r>
-    </w:p>
-    <w:p>
-      <w:pPr>
-        <w:pStyle w:val="Compact"/>
-        <w:numPr>
-          <w:ilvl w:val="1"/>
-          <w:numId w:val="1006"/>
-        </w:numPr>
-      </w:pPr>
-      <w:r>
-        <w:t xml:space="preserve">Se sacan Garud y la tesis propia.</w:t>
-      </w:r>
-    </w:p>
-    <w:p>
-      <w:pPr>
-        <w:pStyle w:val="Compact"/>
-        <w:numPr>
-          <w:ilvl w:val="0"/>
-          <w:numId w:val="1005"/>
-        </w:numPr>
+        <w:t xml:space="preserve">Del texto LaTeX:</w:t>
+      </w:r>
+      <w:r>
+        <w:t xml:space="preserve"> </w:t>
+      </w:r>
+      <w:r>
+        <w:t xml:space="preserve">se suman la Justificación (Ley 27.612) y la organización por capítulos.</w:t>
+      </w:r>
+    </w:p>
+    <w:p>
+      <w:pPr>
+        <w:pStyle w:val="FirstParagraph"/>
       </w:pPr>
       <w:r>
         <w:rPr>
           <w:b/>
           <w:bCs/>
         </w:rPr>
-        <w:t xml:space="preserve">Canal cuasifiscal del shock de la FED:</w:t>
-      </w:r>
-      <w:r>
-        <w:t xml:space="preserve"> </w:t>
-      </w:r>
-      <w:r>
-        <w:t xml:space="preserve">se redacta en pasado.</w:t>
+        <w:t xml:space="preserve">Antecedentes:</w:t>
       </w:r>
     </w:p>
     <w:p>
@@ -2616,13 +2525,13 @@
           <w:b/>
           <w:bCs/>
         </w:rPr>
-        <w:t xml:space="preserve">Pregunta e hipótesis:</w:t>
-      </w:r>
-      <w:r>
-        <w:t xml:space="preserve"> </w:t>
-      </w:r>
-      <w:r>
-        <w:t xml:space="preserve">se acorta la pregunta, se agregan seis objetivos específicos y H1a pasa a ser contrastable.</w:t>
+        <w:t xml:space="preserve">Fusión con el texto LaTeX:</w:t>
+      </w:r>
+      <w:r>
+        <w:t xml:space="preserve"> </w:t>
+      </w:r>
+      <w:r>
+        <w:t xml:space="preserve">se fusionaron los ocho ejes del LaTeX con la versión de Santiago, incluido su párrafo sobre Everaert y Jansen.</w:t>
       </w:r>
     </w:p>
     <w:p>
@@ -2638,55 +2547,64 @@
           <w:b/>
           <w:bCs/>
         </w:rPr>
-        <w:t xml:space="preserve">Del texto LaTeX:</w:t>
-      </w:r>
-      <w:r>
-        <w:t xml:space="preserve"> </w:t>
-      </w:r>
-      <w:r>
-        <w:t xml:space="preserve">se suman la Justificación (Ley 27.612) y la organización por capítulos.</w:t>
-      </w:r>
-    </w:p>
-    <w:p>
-      <w:pPr>
-        <w:pStyle w:val="FirstParagraph"/>
+        <w:t xml:space="preserve">Porcentaje en Hébert y Schreger:</w:t>
+      </w:r>
+      <w:r>
+        <w:t xml:space="preserve"> </w:t>
+      </w:r>
+      <w:r>
+        <w:t xml:space="preserve">se corrigió a</w:t>
+      </w:r>
+      <w:r>
+        <w:t xml:space="preserve"> </w:t>
+      </w:r>
+      <w:r>
+        <w:t xml:space="preserve">“10 puntos porcentuales”</w:t>
+      </w:r>
+      <w:r>
+        <w:t xml:space="preserve">.</w:t>
+      </w:r>
+    </w:p>
+    <w:p>
+      <w:pPr>
+        <w:pStyle w:val="Compact"/>
+        <w:numPr>
+          <w:ilvl w:val="0"/>
+          <w:numId w:val="1005"/>
+        </w:numPr>
       </w:pPr>
       <w:r>
         <w:rPr>
           <w:b/>
           <w:bCs/>
         </w:rPr>
-        <w:t xml:space="preserve">Antecedentes:</w:t>
-      </w:r>
-    </w:p>
-    <w:p>
-      <w:pPr>
-        <w:pStyle w:val="Compact"/>
-        <w:numPr>
-          <w:ilvl w:val="0"/>
-          <w:numId w:val="1007"/>
-        </w:numPr>
+        <w:t xml:space="preserve">Cifras del FMI:</w:t>
+      </w:r>
+      <w:r>
+        <w:t xml:space="preserve"> </w:t>
+      </w:r>
+      <w:r>
+        <w:t xml:space="preserve">las del salto de 2023 se apoyan ahora en el informe de 2025, y las de 2024 quedan marcadas para verificar.</w:t>
+      </w:r>
+    </w:p>
+    <w:p>
+      <w:pPr>
+        <w:pStyle w:val="FirstParagraph"/>
       </w:pPr>
       <w:r>
         <w:rPr>
           <w:b/>
           <w:bCs/>
         </w:rPr>
-        <w:t xml:space="preserve">Fusión con el texto LaTeX:</w:t>
-      </w:r>
-      <w:r>
-        <w:t xml:space="preserve"> </w:t>
-      </w:r>
-      <w:r>
-        <w:t xml:space="preserve">se fusionaron los ocho ejes del LaTeX con la versión de Santiago, incluido su párrafo sobre Everaert y Jansen.</w:t>
-      </w:r>
-    </w:p>
-    <w:p>
-      <w:pPr>
-        <w:pStyle w:val="Compact"/>
-        <w:numPr>
-          <w:ilvl w:val="0"/>
-          <w:numId w:val="1007"/>
+        <w:t xml:space="preserve">Vacancia:</w:t>
+      </w:r>
+    </w:p>
+    <w:p>
+      <w:pPr>
+        <w:pStyle w:val="Compact"/>
+        <w:numPr>
+          <w:ilvl w:val="0"/>
+          <w:numId w:val="1006"/>
         </w:numPr>
       </w:pPr>
       <w:r>
@@ -2694,30 +2612,21 @@
           <w:b/>
           <w:bCs/>
         </w:rPr>
-        <w:t xml:space="preserve">Porcentaje en Hébert y Schreger:</w:t>
-      </w:r>
-      <w:r>
-        <w:t xml:space="preserve"> </w:t>
-      </w:r>
-      <w:r>
-        <w:t xml:space="preserve">se corrigió a</w:t>
-      </w:r>
-      <w:r>
-        <w:t xml:space="preserve"> </w:t>
-      </w:r>
-      <w:r>
-        <w:t xml:space="preserve">“10 puntos porcentuales”</w:t>
-      </w:r>
-      <w:r>
-        <w:t xml:space="preserve">.</w:t>
-      </w:r>
-    </w:p>
-    <w:p>
-      <w:pPr>
-        <w:pStyle w:val="Compact"/>
-        <w:numPr>
-          <w:ilvl w:val="0"/>
-          <w:numId w:val="1007"/>
+        <w:t xml:space="preserve">Afirmación corregida:</w:t>
+      </w:r>
+      <w:r>
+        <w:t xml:space="preserve"> </w:t>
+      </w:r>
+      <w:r>
+        <w:t xml:space="preserve">se reescribió la idea de que el marco del FMI excluye al BCRA. El marco lo admite (FMI, 2021). En su análisis de Argentina, el FMI usa la deuda federal bruta y muestra la consolidada solo como cuadro (FMI, 2025).</w:t>
+      </w:r>
+    </w:p>
+    <w:p>
+      <w:pPr>
+        <w:pStyle w:val="Compact"/>
+        <w:numPr>
+          <w:ilvl w:val="0"/>
+          <w:numId w:val="1006"/>
         </w:numPr>
       </w:pPr>
       <w:r>
@@ -2725,62 +2634,6 @@
           <w:b/>
           <w:bCs/>
         </w:rPr>
-        <w:t xml:space="preserve">Cifras del FMI:</w:t>
-      </w:r>
-      <w:r>
-        <w:t xml:space="preserve"> </w:t>
-      </w:r>
-      <w:r>
-        <w:t xml:space="preserve">las del salto de 2023 se apoyan ahora en el informe de 2025, y las de 2024 quedan marcadas para verificar.</w:t>
-      </w:r>
-    </w:p>
-    <w:p>
-      <w:pPr>
-        <w:pStyle w:val="FirstParagraph"/>
-      </w:pPr>
-      <w:r>
-        <w:rPr>
-          <w:b/>
-          <w:bCs/>
-        </w:rPr>
-        <w:t xml:space="preserve">Vacancia:</w:t>
-      </w:r>
-    </w:p>
-    <w:p>
-      <w:pPr>
-        <w:pStyle w:val="Compact"/>
-        <w:numPr>
-          <w:ilvl w:val="0"/>
-          <w:numId w:val="1008"/>
-        </w:numPr>
-      </w:pPr>
-      <w:r>
-        <w:rPr>
-          <w:b/>
-          <w:bCs/>
-        </w:rPr>
-        <w:t xml:space="preserve">Afirmación corregida:</w:t>
-      </w:r>
-      <w:r>
-        <w:t xml:space="preserve"> </w:t>
-      </w:r>
-      <w:r>
-        <w:t xml:space="preserve">se reescribió la idea de que el marco del FMI excluye al BCRA. El marco lo admite (FMI, 2021). En su análisis de Argentina, el FMI usa la deuda federal bruta y muestra la consolidada solo como cuadro (FMI, 2025).</w:t>
-      </w:r>
-    </w:p>
-    <w:p>
-      <w:pPr>
-        <w:pStyle w:val="Compact"/>
-        <w:numPr>
-          <w:ilvl w:val="0"/>
-          <w:numId w:val="1008"/>
-        </w:numPr>
-      </w:pPr>
-      <w:r>
-        <w:rPr>
-          <w:b/>
-          <w:bCs/>
-        </w:rPr>
         <w:t xml:space="preserve">Párrafo cortado:</w:t>
       </w:r>
       <w:r>
@@ -2790,126 +2643,126 @@
         <w:t xml:space="preserve">el párrafo de Santiago sobre la subordinación del BCRA, que estaba cortado, se completó y quedó marcado para verificar.</w:t>
       </w:r>
     </w:p>
+    <w:bookmarkEnd w:id="36"/>
+    <w:bookmarkStart w:id="37" w:name="nota-4.-pendientes-de-verificación"/>
+    <w:p>
+      <w:pPr>
+        <w:pStyle w:val="Heading2"/>
+      </w:pPr>
+      <w:r>
+        <w:t xml:space="preserve">Nota 4. Pendientes de verificación</w:t>
+      </w:r>
+    </w:p>
+    <w:p>
+      <w:pPr>
+        <w:pStyle w:val="Compact"/>
+        <w:numPr>
+          <w:ilvl w:val="0"/>
+          <w:numId w:val="1007"/>
+        </w:numPr>
+      </w:pPr>
+      <w:r>
+        <w:t xml:space="preserve">Si hubo emisión bajo ley de Nueva York en 2026.</w:t>
+      </w:r>
+    </w:p>
+    <w:p>
+      <w:pPr>
+        <w:pStyle w:val="Compact"/>
+        <w:numPr>
+          <w:ilvl w:val="0"/>
+          <w:numId w:val="1007"/>
+        </w:numPr>
+      </w:pPr>
+      <w:r>
+        <w:t xml:space="preserve">La fuente oficial de la colocación de diciembre de 2025.</w:t>
+      </w:r>
+    </w:p>
+    <w:p>
+      <w:pPr>
+        <w:pStyle w:val="Compact"/>
+        <w:numPr>
+          <w:ilvl w:val="0"/>
+          <w:numId w:val="1007"/>
+        </w:numPr>
+      </w:pPr>
+      <w:r>
+        <w:t xml:space="preserve">El nivel de los pasivos del BCRA a fines de 2025 en nuestra serie.</w:t>
+      </w:r>
+    </w:p>
+    <w:p>
+      <w:pPr>
+        <w:pStyle w:val="Compact"/>
+        <w:numPr>
+          <w:ilvl w:val="0"/>
+          <w:numId w:val="1007"/>
+        </w:numPr>
+      </w:pPr>
+      <w:r>
+        <w:t xml:space="preserve">Las cuatro referencias con dos versiones distintas: Adler y Sosa, Adler y Magud, Cetrángolo et al., y Wijayanti y Rachmanira.</w:t>
+      </w:r>
+    </w:p>
+    <w:p>
+      <w:pPr>
+        <w:pStyle w:val="Compact"/>
+        <w:numPr>
+          <w:ilvl w:val="0"/>
+          <w:numId w:val="1007"/>
+        </w:numPr>
+      </w:pPr>
+      <w:r>
+        <w:t xml:space="preserve">Bouabdallah et al. (2017).</w:t>
+      </w:r>
+    </w:p>
+    <w:p>
+      <w:pPr>
+        <w:pStyle w:val="Compact"/>
+        <w:numPr>
+          <w:ilvl w:val="0"/>
+          <w:numId w:val="1007"/>
+        </w:numPr>
+      </w:pPr>
+      <w:r>
+        <w:t xml:space="preserve">Las cifras de FMI (2024).</w:t>
+      </w:r>
+    </w:p>
+    <w:p>
+      <w:pPr>
+        <w:pStyle w:val="Compact"/>
+        <w:numPr>
+          <w:ilvl w:val="0"/>
+          <w:numId w:val="1007"/>
+        </w:numPr>
+      </w:pPr>
+      <w:r>
+        <w:t xml:space="preserve">Porto (2020) y Damill et al. (2015) para el párrafo del BCRA.</w:t>
+      </w:r>
+    </w:p>
+    <w:p>
+      <w:pPr>
+        <w:pStyle w:val="Compact"/>
+        <w:numPr>
+          <w:ilvl w:val="0"/>
+          <w:numId w:val="1007"/>
+        </w:numPr>
+      </w:pPr>
+      <w:r>
+        <w:t xml:space="preserve">Klemm et al. (2014).</w:t>
+      </w:r>
+    </w:p>
+    <w:p>
+      <w:pPr>
+        <w:pStyle w:val="Compact"/>
+        <w:numPr>
+          <w:ilvl w:val="0"/>
+          <w:numId w:val="1007"/>
+        </w:numPr>
+      </w:pPr>
+      <w:r>
+        <w:t xml:space="preserve">Levy Yeyati y Sturzenegger: confirmar que su VAR no incluye riesgo soberano.</w:t>
+      </w:r>
+    </w:p>
     <w:bookmarkEnd w:id="37"/>
-    <w:bookmarkStart w:id="38" w:name="nota-5.-pendientes-de-verificación"/>
-    <w:p>
-      <w:pPr>
-        <w:pStyle w:val="Heading2"/>
-      </w:pPr>
-      <w:r>
-        <w:t xml:space="preserve">Nota 5. Pendientes de verificación</w:t>
-      </w:r>
-    </w:p>
-    <w:p>
-      <w:pPr>
-        <w:pStyle w:val="Compact"/>
-        <w:numPr>
-          <w:ilvl w:val="0"/>
-          <w:numId w:val="1009"/>
-        </w:numPr>
-      </w:pPr>
-      <w:r>
-        <w:t xml:space="preserve">Si hubo emisión bajo ley de Nueva York en 2026.</w:t>
-      </w:r>
-    </w:p>
-    <w:p>
-      <w:pPr>
-        <w:pStyle w:val="Compact"/>
-        <w:numPr>
-          <w:ilvl w:val="0"/>
-          <w:numId w:val="1009"/>
-        </w:numPr>
-      </w:pPr>
-      <w:r>
-        <w:t xml:space="preserve">La fuente oficial de la colocación de diciembre de 2025.</w:t>
-      </w:r>
-    </w:p>
-    <w:p>
-      <w:pPr>
-        <w:pStyle w:val="Compact"/>
-        <w:numPr>
-          <w:ilvl w:val="0"/>
-          <w:numId w:val="1009"/>
-        </w:numPr>
-      </w:pPr>
-      <w:r>
-        <w:t xml:space="preserve">El nivel de los pasivos del BCRA a fines de 2025 en nuestra serie.</w:t>
-      </w:r>
-    </w:p>
-    <w:p>
-      <w:pPr>
-        <w:pStyle w:val="Compact"/>
-        <w:numPr>
-          <w:ilvl w:val="0"/>
-          <w:numId w:val="1009"/>
-        </w:numPr>
-      </w:pPr>
-      <w:r>
-        <w:t xml:space="preserve">Las cuatro referencias con dos versiones distintas: Adler y Sosa, Adler y Magud, Cetrángolo et al., y Wijayanti y Rachmanira.</w:t>
-      </w:r>
-    </w:p>
-    <w:p>
-      <w:pPr>
-        <w:pStyle w:val="Compact"/>
-        <w:numPr>
-          <w:ilvl w:val="0"/>
-          <w:numId w:val="1009"/>
-        </w:numPr>
-      </w:pPr>
-      <w:r>
-        <w:t xml:space="preserve">Bouabdallah et al. (2017).</w:t>
-      </w:r>
-    </w:p>
-    <w:p>
-      <w:pPr>
-        <w:pStyle w:val="Compact"/>
-        <w:numPr>
-          <w:ilvl w:val="0"/>
-          <w:numId w:val="1009"/>
-        </w:numPr>
-      </w:pPr>
-      <w:r>
-        <w:t xml:space="preserve">Las cifras de FMI (2024).</w:t>
-      </w:r>
-    </w:p>
-    <w:p>
-      <w:pPr>
-        <w:pStyle w:val="Compact"/>
-        <w:numPr>
-          <w:ilvl w:val="0"/>
-          <w:numId w:val="1009"/>
-        </w:numPr>
-      </w:pPr>
-      <w:r>
-        <w:t xml:space="preserve">Porto (2020) y Damill et al. (2015) para el párrafo del BCRA.</w:t>
-      </w:r>
-    </w:p>
-    <w:p>
-      <w:pPr>
-        <w:pStyle w:val="Compact"/>
-        <w:numPr>
-          <w:ilvl w:val="0"/>
-          <w:numId w:val="1009"/>
-        </w:numPr>
-      </w:pPr>
-      <w:r>
-        <w:t xml:space="preserve">Klemm et al. (2014).</w:t>
-      </w:r>
-    </w:p>
-    <w:p>
-      <w:pPr>
-        <w:pStyle w:val="Compact"/>
-        <w:numPr>
-          <w:ilvl w:val="0"/>
-          <w:numId w:val="1009"/>
-        </w:numPr>
-      </w:pPr>
-      <w:r>
-        <w:t xml:space="preserve">Levy Yeyati y Sturzenegger: confirmar que su VAR no incluye riesgo soberano.</w:t>
-      </w:r>
-    </w:p>
     <w:bookmarkEnd w:id="38"/>
-    <w:bookmarkEnd w:id="39"/>
     <w:sectPr>
       <w:footnotePr>
         <w:numRestart w:val="eachSect"/>
@@ -3350,64 +3203,10 @@
     <w:abstractNumId w:val="991"/>
   </w:num>
   <w:num w:numId="1003">
-    <w:abstractNumId w:val="99411"/>
-    <w:lvlOverride w:ilvl="0">
-      <w:startOverride w:val="1"/>
-    </w:lvlOverride>
-    <w:lvlOverride w:ilvl="1">
-      <w:startOverride w:val="1"/>
-    </w:lvlOverride>
-    <w:lvlOverride w:ilvl="2">
-      <w:startOverride w:val="1"/>
-    </w:lvlOverride>
-    <w:lvlOverride w:ilvl="3">
-      <w:startOverride w:val="1"/>
-    </w:lvlOverride>
-    <w:lvlOverride w:ilvl="4">
-      <w:startOverride w:val="1"/>
-    </w:lvlOverride>
-    <w:lvlOverride w:ilvl="5">
-      <w:startOverride w:val="1"/>
-    </w:lvlOverride>
-    <w:lvlOverride w:ilvl="6">
-      <w:startOverride w:val="1"/>
-    </w:lvlOverride>
-    <w:lvlOverride w:ilvl="7">
-      <w:startOverride w:val="1"/>
-    </w:lvlOverride>
-    <w:lvlOverride w:ilvl="8">
-      <w:startOverride w:val="1"/>
-    </w:lvlOverride>
+    <w:abstractNumId w:val="991"/>
   </w:num>
   <w:num w:numId="1004">
-    <w:abstractNumId w:val="99411"/>
-    <w:lvlOverride w:ilvl="0">
-      <w:startOverride w:val="1"/>
-    </w:lvlOverride>
-    <w:lvlOverride w:ilvl="1">
-      <w:startOverride w:val="1"/>
-    </w:lvlOverride>
-    <w:lvlOverride w:ilvl="2">
-      <w:startOverride w:val="1"/>
-    </w:lvlOverride>
-    <w:lvlOverride w:ilvl="3">
-      <w:startOverride w:val="1"/>
-    </w:lvlOverride>
-    <w:lvlOverride w:ilvl="4">
-      <w:startOverride w:val="1"/>
-    </w:lvlOverride>
-    <w:lvlOverride w:ilvl="5">
-      <w:startOverride w:val="1"/>
-    </w:lvlOverride>
-    <w:lvlOverride w:ilvl="6">
-      <w:startOverride w:val="1"/>
-    </w:lvlOverride>
-    <w:lvlOverride w:ilvl="7">
-      <w:startOverride w:val="1"/>
-    </w:lvlOverride>
-    <w:lvlOverride w:ilvl="8">
-      <w:startOverride w:val="1"/>
-    </w:lvlOverride>
+    <w:abstractNumId w:val="991"/>
   </w:num>
   <w:num w:numId="1005">
     <w:abstractNumId w:val="991"/>
@@ -3416,12 +3215,6 @@
     <w:abstractNumId w:val="991"/>
   </w:num>
   <w:num w:numId="1007">
-    <w:abstractNumId w:val="991"/>
-  </w:num>
-  <w:num w:numId="1008">
-    <w:abstractNumId w:val="991"/>
-  </w:num>
-  <w:num w:numId="1009">
     <w:abstractNumId w:val="991"/>
   </w:num>
 </w:numbering>

</xml_diff>

<commit_message>
docs(tesis): citas verificadas y corregidas en Introduccion y Antecedentes
Co-Authored-By: Claude Opus 5.5 <noreply@anthropic.com>
</commit_message>
<xml_diff>
--- a/tesis_oficial_borradores/para_el_grupo/Introduccion_y_Antecedentes_v3.docx
+++ b/tesis_oficial_borradores/para_el_grupo/Introduccion_y_Antecedentes_v3.docx
@@ -63,7 +63,7 @@
         <w:pStyle w:val="BodyText"/>
       </w:pPr>
       <w:r>
-        <w:t xml:space="preserve">La administración que asumió en diciembre de 2023 recibió un elevado stock de pasivos y un acceso muy limitado al crédito voluntario. El regreso a los mercados fue gradual: la primera colocación en dólares se realizó en diciembre de 2025, por USD 1.000 millones a una tasa de 9,26% anual y bajo legislación local. [VERIFICAR antes de entregar: si hubo emisión bajo ley de Nueva York en 2026.] A fines de julio de 2026, la deuda en moneda extranjera de la Administración Central sumaba USD 248.458 millones, y los vencimientos en divisas previstos para el resto del año alcanzaban USD 5.080 millones, de los cuales el 53,5% correspondía a pagos al Fondo Monetario Internacional (FMI) (Oficina de Presupuesto del Congreso [OPC], 2026).</w:t>
+        <w:t xml:space="preserve">La administración que asumió en diciembre de 2023 recibió un elevado stock de pasivos y un acceso muy limitado al crédito voluntario. El regreso a los mercados fue gradual: la primera colocación en dólares se realizó en diciembre de 2025, con un bono a 2029 bajo legislación local por USD 1.000 millones de valor nominal y un rendimiento de 9,26% anual (Secretaría de Finanzas, 2025). A fines de julio de 2026, la deuda en moneda extranjera de la Administración Central sumaba USD 248.458 millones, y los vencimientos en divisas previstos para el resto del año alcanzaban USD 5.080 millones, de los cuales el 53,5% correspondía a pagos al Fondo Monetario Internacional (FMI) (Oficina de Presupuesto del Congreso [OPC], 2026).</w:t>
       </w:r>
     </w:p>
     <w:bookmarkEnd w:id="10"/>
@@ -89,7 +89,7 @@
         <w:pStyle w:val="BodyText"/>
       </w:pPr>
       <w:r>
-        <w:t xml:space="preserve">La evidencia internacional matiza la premisa de que la consolidación presupuestaria alcanza para disipar el riesgo de impago: en promedio, los ajustes fiscales discrecionales tienen un efecto reducido sobre la ratio de deuda, y solo se asocian con reducciones duraderas cuando se aplican en fases de expansión económica (Ando et al., 2025). La sostenibilidad depende además de otros factores. Uno es la capacidad de la economía de generar las divisas que exige el servicio de una deuda dolarizada (Calvo et al., 2003). Otro es el efecto de valuación del tipo de cambio real sobre los pasivos en moneda extranjera (Levy Yeyati y Sturzenegger, 2023). Se suman la volatilidad de los spreads de riesgo país ante shocks financieros externos (Adler y Sosa, 2014) y la menor tolerancia a la deuda de las economías con historia de default (Reinhart et al., 2003). Por último, la incertidumbre macroeconómica reduce el nivel de deuda que un gobierno puede sostener (Mendoza y Oviedo, 2007), y existe un límite político e institucional a los superávits que una sociedad acepta de manera prolongada, conocido como fatiga fiscal (Ghosh et al., 2013).</w:t>
+        <w:t xml:space="preserve">La evidencia internacional matiza la premisa de que la consolidación presupuestaria alcanza para disipar el riesgo de impago: en promedio, los ajustes fiscales discrecionales tienen un efecto reducido sobre la ratio de deuda, y solo se asocian con reducciones duraderas cuando se aplican en fases de expansión económica (Ando et al., 2025). La sostenibilidad depende además de otros factores. Uno es la capacidad de la economía de generar las divisas que exige el servicio de una deuda dolarizada (Calvo et al., 2003). Otro es el efecto de valuación del tipo de cambio real sobre los pasivos en moneda extranjera (Levy Yeyati y Sturzenegger, 2023). Se suman la exposición de la deuda a las condiciones financieras externas (Adler y Sosa, 2013) y la menor tolerancia a la deuda de las economías con historia de default (Reinhart et al., 2003). Por último, la incertidumbre macroeconómica reduce el nivel de deuda que un gobierno puede sostener (Mendoza y Oviedo, 2009), y existe un límite político e institucional a los superávits que una sociedad acepta de manera prolongada, conocido como fatiga fiscal (Ghosh et al., 2013).</w:t>
       </w:r>
     </w:p>
     <w:bookmarkEnd w:id="11"/>
@@ -123,7 +123,7 @@
         <w:pStyle w:val="BodyText"/>
       </w:pPr>
       <w:r>
-        <w:t xml:space="preserve">La elección de esta perturbación se fundamenta en que opera simultáneamente sobre varios canales. Encarece el financiamiento externo y eleva el riesgo soberano (Klemm et al., 2014). Desencadena una depreciación del tipo de cambio real, con efectos de valuación sobre los pasivos dolarizados (Adler y Sosa, 2014; Calvo et al., 2003). Deprime el crecimiento y, con ello, deteriora el diferencial entre la tasa de interés y el crecimiento (Blanchard, 2019; Neumeyer y Perri, 2005; Uribe y Yue, 2006). Por último, condiciona la transmisión de la política monetaria doméstica en las economías emergentes (Renzhi y Beirne, 2024). En Argentina, ese último canal operó durante buena parte del período histórico a través del costo de los pasivos remunerados del BCRA, cuyo stock llegó a 18,4% del PIB en 2023 y cayó a 2,2% en 2024, cuando la esterilización monetaria pasó al Tesoro (FMI, 2025, anexo II, cuadro 2).</w:t>
+        <w:t xml:space="preserve">La elección de esta perturbación se fundamenta en que opera simultáneamente sobre varios canales. Encarece el financiamiento externo y eleva el riesgo soberano (Uribe y Yue, 2006). Desencadena una depreciación del tipo de cambio real, con efectos de valuación sobre los pasivos dolarizados (Calvo et al., 2003). Deprime el crecimiento y, con ello, deteriora el diferencial entre la tasa de interés y el crecimiento (Blanchard, 2019; Neumeyer y Perri, 2005; Uribe y Yue, 2006). Por último, condiciona la transmisión de la política monetaria doméstica en las economías emergentes (Renzhi y Beirne, 2024). En Argentina, ese último canal operó durante buena parte del período histórico a través del costo de los pasivos remunerados del BCRA, cuyo stock llegó a 18,4% del PIB en 2023 y cayó a 2,2% en 2024, cuando la esterilización monetaria pasó al Tesoro (FMI, 2025, anexo II, cuadro 2).</w:t>
       </w:r>
     </w:p>
     <w:bookmarkEnd w:id="12"/>
@@ -358,7 +358,7 @@
         <w:pStyle w:val="FirstParagraph"/>
       </w:pPr>
       <w:r>
-        <w:t xml:space="preserve">Este capítulo ordena la literatura relevante en ocho ejes. Los cuatro primeros provienen de la literatura argentina reciente: las limitaciones de los enfoques contables (Rodríguez, 2023; Sanches, 2019), la economía política del endeudamiento y de las reestructuraciones (Aruguete, 2021; Roldán, 2021), las consecuencias materiales del ciclo financiero (Bohoslavsky y Cantamutto, 2024; Cantamutto et al., 2024) y la literatura que relativiza la urgencia de la fatiga fiscal (Blanchard, 1990, 2019; Everaert y Jansen, 2018). Los cuatro restantes reúnen la literatura internacional de simulación estocástica de deuda y tres antecedentes específicos sobre Argentina: la tradición que combina modelos VAR con simulación (Medeiros, 2012; Adler y Sosa, 2014; Wijayanti y Rachmanira, 2020), las dos lecturas de la antesala de la crisis de 2001-2002 (Cetrángolo et al., 1997; Calvo et al., 2003), la controversia entre la ratio deuda/PIB y el balance patrimonial (Levy Yeyati y Sturzenegger, 2023) y el costo real del default (Hébert y Schreger, 2017). El capítulo cierra con el área de vacancia.</w:t>
+        <w:t xml:space="preserve">Este capítulo ordena la literatura relevante en ocho ejes. Los cuatro primeros provienen de la literatura argentina reciente: las limitaciones de los enfoques contables (Rodríguez, 2023; Sanches, 2019), la economía política del endeudamiento y de las reestructuraciones (Aruguete, 2021; Roldán, 2021), las consecuencias materiales del ciclo financiero (Bohoslavsky y Cantamutto, 2024; Cantamutto et al., 2024) y la literatura que relativiza la urgencia de la fatiga fiscal (Blanchard, 1990, 2019; Everaert y Jansen, 2018). Los cuatro restantes reúnen la literatura internacional de simulación estocástica de deuda y tres antecedentes específicos sobre Argentina: la tradición que combina modelos VAR con simulación (Medeiros, 2012; Adler y Sosa, 2013; Wijayanti y Rachmanira, 2020), las dos lecturas de la antesala de la crisis de 2001-2002 (Cetrángolo et al., 1997; Calvo et al., 2003), la controversia entre la ratio deuda/PIB y el balance patrimonial (Levy Yeyati y Sturzenegger, 2023) y el costo real del default (Hébert y Schreger, 2017). El capítulo cierra con el área de vacancia.</w:t>
       </w:r>
     </w:p>
     <w:bookmarkStart w:id="20" w:name="Xd30872c284e5b335f776e4fb8cf86880297864c"/>
@@ -527,7 +527,7 @@
         <w:pStyle w:val="BodyText"/>
       </w:pPr>
       <w:r>
-        <w:t xml:space="preserve">Un segundo cuerpo de literatura llevó el problema a economías emergentes expuestas a shocks de términos de intercambio y a interrupciones del financiamiento. Adler y Sosa (2014) estimaron modelos VAR globales y de panel para países de América Latina, con un índice de precios netos de materias primas como variable externa (Adler y Magud, 2014). Encontraron que más de la mitad de la variabilidad de las entradas de capital de corto plazo responde a condiciones internacionales, como la tasa de la Reserva Federal y el índice VIX, y no a factores locales. Es decir, la sostenibilidad de la deuda en la región depende en buena medida de factores de empuje externos (</w:t>
+        <w:t xml:space="preserve">Un segundo cuerpo de literatura llevó el problema a economías emergentes expuestas a shocks externos. Adler y Sosa (2013) estimaron, país por país, modelos VAR para economías de América Latina con el crecimiento mundial, el índice VIX y los precios de las materias primas como variables externas, y simularon la trayectoria de la deuda bajo escenarios externos adversos. Entre las variables globales, el VIX fue la única con efectos significativos y robustos. Es decir, la sostenibilidad de la deuda en la región depende en buena medida de factores de empuje externos (</w:t>
       </w:r>
       <w:r>
         <w:rPr>
@@ -546,7 +546,7 @@
         <w:footnoteReference w:id="25"/>
       </w:r>
       <w:r>
-        <w:t xml:space="preserve">. El mismo estudio documentó una asimetría argentina: en las crisis, el capital residente tiende a sumarse a la salida en lugar de repatriarse para amortiguarla.</w:t>
+        <w:t xml:space="preserve">. Adler et al. (2016), con un VAR de panel de 38 economías emergentes entre 1990 y 2012, encontraron que los inversores locales amortiguan los shocks de incertidumbre global y de tasas largas de Estados Unidos, pero frente a las subas de tasas cortas se comportan igual que los no residentes, lo que vuelve especialmente relevante un shock de la política monetaria estadounidense.</w:t>
       </w:r>
     </w:p>
     <w:p>
@@ -576,7 +576,7 @@
         <w:t xml:space="preserve"> </w:t>
       </w:r>
       <w:r>
-        <w:t xml:space="preserve">buscó anticipar crisis de deuda con otro objetivo: no explicar mecanismos, sino maximizar el poder predictivo. Wijayanti y Rachmanira (2020) aplicaron el enfoque de señales de Kaminsky, Lizondo y Reinhart y una regresión logística a un panel de 43 países en desarrollo entre 1960 y 2017. Predijeron el 61,5% de las crisis de deuda con dos años de anticipación, con un umbral de probabilidad del 30%. El resultado expone una tensión: estos sistemas maximizan el poder predictivo sobre un panel amplio, mientras que el gráfico de abanico del FMI busca representar la distribución de riesgo de un país en particular, y ambos enfoques pueden dar señales distintas frente a un mismo episodio.</w:t>
+        <w:t xml:space="preserve">buscó anticipar crisis de deuda con otro objetivo: no explicar mecanismos, sino maximizar el poder predictivo. Wijayanti y Rachmanira (2020) aplicaron el enfoque de señales de Kaminsky, Lizondo y Reinhart y una regresión logística a un panel de 43 países en desarrollo entre 1960 y 2017. Predijeron el 61,5% de las crisis de deuda con dos años de anticipación. El resultado expone una tensión: estos sistemas maximizan el poder predictivo sobre un panel amplio, mientras que el gráfico de abanico del FMI busca representar la distribución de riesgo de un país en particular, y ambos enfoques pueden dar señales distintas frente a un mismo episodio.</w:t>
       </w:r>
     </w:p>
     <w:bookmarkEnd w:id="27"/>
@@ -620,7 +620,7 @@
         <w:pStyle w:val="FirstParagraph"/>
       </w:pPr>
       <w:r>
-        <w:t xml:space="preserve">Dos décadas después, la discusión volvió sobre si la ratio deuda/PIB es una medida confiable de riesgo cuando hay un salto cambiario. Rodríguez (2023) atribuye la caída de la ratio entre 2003 y 2011 a un efecto contable de la apreciación real, más que a un desendeudamiento genuino. El mismo mecanismo, en sentido inverso, explica que el salto cambiario de fines de 2023 llevara la deuda federal bruta a más del 150% del PIB (FMI, 2025, anexo II). En el marco del FMI, ese salto ensanchó el gráfico de abanico y llevó la señal mecánica de riesgo a</w:t>
+        <w:t xml:space="preserve">Dos décadas después, la discusión volvió sobre si la ratio deuda/PIB es una medida confiable de riesgo cuando hay un salto cambiario. Rodríguez (2023) atribuye la caída de la ratio entre 2003 y 2011 a un efecto contable de la apreciación real, más que a un desendeudamiento genuino. El mismo mecanismo, en sentido inverso, explica que el salto cambiario de fines de 2023 llevara la deuda al 156,7% del PIB. En el marco del FMI, ese salto ensanchó el gráfico de abanico hasta 122,7 puntos y llevó la señal mecánica de riesgo a</w:t>
       </w:r>
       <w:r>
         <w:t xml:space="preserve"> </w:t>
@@ -629,7 +629,7 @@
         <w:t xml:space="preserve">“alto”</w:t>
       </w:r>
       <w:r>
-        <w:t xml:space="preserve">. El propio FMI matizó esa lectura y, una vez que el efecto de la devaluación se disipó, la señal volvió a</w:t>
+        <w:t xml:space="preserve">, que el propio personal técnico del organismo descartó por no reflejar el riesgo de mediano plazo (FMI, 2024). Una vez disipado el efecto de la devaluación, el ancho del abanico bajó a 74,2 puntos y la señal volvió a</w:t>
       </w:r>
       <w:r>
         <w:t xml:space="preserve"> </w:t>
@@ -641,7 +641,7 @@
         <w:t xml:space="preserve"> </w:t>
       </w:r>
       <w:r>
-        <w:t xml:space="preserve">(FMI, 2025, anexo II). [VERIFICAR en FMI (2024) las cifras de 156,7% del PIB y de 122,7 puntos de ancho del abanico que citaba la versión anterior.]</w:t>
+        <w:t xml:space="preserve">(FMI, 2025, anexo II).</w:t>
       </w:r>
     </w:p>
     <w:p>
@@ -748,7 +748,7 @@
         <w:t xml:space="preserve"> </w:t>
       </w:r>
       <w:r>
-        <w:t xml:space="preserve">La literatura local, desde el enfoque contable (Rodríguez, 2023; Sanches, 2019) y desde la economía política (Aruguete, 2021; Bohoslavsky y Cantamutto, 2024; Cantamutto et al., 2024), vincula el esfuerzo fiscal y el riesgo soberano de forma argumentativa. Pero no estima un sistema en el que los shocks se propaguen entre el resultado fiscal, el riesgo país, el tipo de cambio real y la actividad. La literatura internacional sí modela esa transmisión, aunque sobre paneles de países (Medeiros, 2012; Adler y Sosa, 2014). En la evaluación más reciente de funciones de reacción fiscal para América Latina y el Caribe, Argentina ni siquiera integra el grupo de países con series aptas para una estimación individual (González y Hernández, 2023). El gráfico de abanico del FMI, por su parte, aplica al escenario base shocks tomados de la historia de los determinantes de la deuda, sin identificar su origen (FMI, 2021, párr. 52), y por eso no permite atribuir el riesgo a una perturbación concreta.</w:t>
+        <w:t xml:space="preserve">La literatura local, desde el enfoque contable (Rodríguez, 2023; Sanches, 2019) y desde la economía política (Aruguete, 2021; Bohoslavsky y Cantamutto, 2024; Cantamutto et al., 2024), vincula el esfuerzo fiscal y el riesgo soberano de forma argumentativa. Pero no estima un sistema en el que los shocks se propaguen entre el resultado fiscal, el riesgo país, el tipo de cambio real y la actividad. La literatura internacional sí modela esa transmisión, aunque sobre paneles de países (Medeiros, 2012; Adler et al., 2016). En la evaluación más reciente de funciones de reacción fiscal para América Latina y el Caribe, Argentina ni siquiera integra el grupo de países con series aptas para una estimación individual (González y Hernández, 2023). El gráfico de abanico del FMI, por su parte, aplica al escenario base shocks tomados de la historia de los determinantes de la deuda, sin identificar su origen (FMI, 2021, párr. 52), y por eso no permite atribuir el riesgo a una perturbación concreta.</w:t>
       </w:r>
     </w:p>
     <w:p>
@@ -766,7 +766,7 @@
         <w:t xml:space="preserve"> </w:t>
       </w:r>
       <w:r>
-        <w:t xml:space="preserve">Los efectos de la política monetaria de la Reserva Federal sobre América Latina se estudiaron en paneles regionales, sobre flujos de capital, spreads y actividad (Adler y Sosa, 2014; Klemm et al., 2014). No se tradujeron en un cambio en la probabilidad de que la deuda argentina no se estabilice. Levy Yeyati y Sturzenegger (2023) incluyen la tasa internacional en su VAR, pero su variable de interés es el patrimonio neto del sector público y su sistema no incorpora el riesgo soberano ni la respuesta fiscal.</w:t>
+        <w:t xml:space="preserve">Los efectos de la política monetaria de Estados Unidos sobre las economías emergentes se estudiaron sobre los spreads y la actividad (Uribe y Yue, 2006) y sobre los flujos de capital en paneles de países (Adler et al., 2016). No se tradujeron en un cambio en la probabilidad de que la deuda argentina no se estabilice. Levy Yeyati y Sturzenegger (2023) incluyen la tasa internacional en su VAR, pero su variable de interés es el patrimonio neto del sector público y su sistema no incorpora el riesgo soberano ni la respuesta fiscal.</w:t>
       </w:r>
     </w:p>
     <w:p>
@@ -792,7 +792,7 @@
         <w:pStyle w:val="BodyText"/>
       </w:pPr>
       <w:r>
-        <w:t xml:space="preserve">Esa omisión importa por razones institucionales. El BCRA careció durante buena parte del período de independencia funcional frente al Tesoro. Tras la crisis de 2001-2002, la reaparición del déficit derivó en un uso creciente de su balance, mediante la cancelación de deuda con reservas y la transferencia de utilidades, y la reforma de su Carta Orgánica de 2012 amplió los márgenes legales de asistencia al Tesoro (Damill et al., 2015; Porto, 2020). La absorción de esa liquidez se hizo con pasivos remunerados: letras (LEBAC y NOBAC) hasta 2018, Leliq y pases entre 2018 y 2024, que respondieron a los mismos shocks cambiarios y de riesgo que la deuda del Tesoro. [VERIFICAR en Porto (2020) y Damill et al. (2015) el respaldo de cada afirmación de este párrafo; el texto de Santiago estaba cortado a mitad de oración y se completó con la cronología de los instrumentos.] Un modelo estimado solo sobre la deuda del Tesoro omite esa parte del endeudamiento y puede subestimar la sensibilidad de la deuda a esos shocks. Esto sigue siendo cierto aunque, desde 2024, los pasivos del BCRA se hayan reducido a niveles mínimos: la proyección parte de un BCRA casi sin pasivos, pero los parámetros que la gobiernan se estiman sobre tres décadas en las que no fue así.</w:t>
+        <w:t xml:space="preserve">Esa omisión importa por razones institucionales. La autonomía formal que el BCRA había obtenido en 1992 se redujo de manera progresiva desde 2002, y en especial entre 2010 y 2012, cuando la reforma de su Carta Orgánica amplió los márgenes legales de asistencia al Tesoro (Damill et al., 2015). En ese período, el Tesoro canceló deuda externa con reservas del BCRA (Damill et al., 2015), y entre 2003 y 2015 las utilidades del BCRA se convirtieron en una fuente regular de ingresos extraordinarios del Tesoro (Porto, 2020). La absorción de esa liquidez se hizo con pasivos remunerados: letras (LEBAC y NOBAC) hasta 2018, Leliq y pases entre 2018 y 2024, que respondieron a los mismos shocks cambiarios y de riesgo que la deuda del Tesoro. Un modelo estimado solo sobre la deuda del Tesoro omite esa parte del endeudamiento y puede subestimar la sensibilidad de la deuda a esos shocks. Esto sigue siendo cierto aunque, desde 2024, los pasivos del BCRA se hayan reducido a niveles mínimos: la proyección parte de un BCRA casi sin pasivos, pero los parámetros que la gobiernan se estiman sobre tres décadas en las que no fue así.</w:t>
       </w:r>
     </w:p>
     <w:p>
@@ -823,97 +823,32 @@
         </w:numPr>
       </w:pPr>
       <w:r>
-        <w:t xml:space="preserve">Adler, G., y Magud, N. E. (2014). [VERIFICAR: en</w:t>
-      </w:r>
-      <w:r>
-        <w:t xml:space="preserve"> </w:t>
-      </w:r>
-      <w:r>
-        <w:rPr>
-          <w:rStyle w:val="VerbatimChar"/>
-        </w:rPr>
-        <w:t xml:space="preserve">referencias.bib</w:t>
-      </w:r>
-      <w:r>
-        <w:t xml:space="preserve"> </w:t>
-      </w:r>
-      <w:r>
-        <w:t xml:space="preserve">figura</w:t>
-      </w:r>
-      <w:r>
-        <w:t xml:space="preserve"> </w:t>
-      </w:r>
-      <w:r>
-        <w:rPr>
-          <w:i/>
-          <w:iCs/>
-        </w:rPr>
-        <w:t xml:space="preserve">Four decades of terms-of-trade booms: A metric of income windfall</w:t>
-      </w:r>
-      <w:r>
-        <w:t xml:space="preserve"> </w:t>
-      </w:r>
-      <w:r>
-        <w:t xml:space="preserve">(IMF Working Paper WP/14/103), y Santiago cita</w:t>
-      </w:r>
-      <w:r>
-        <w:t xml:space="preserve"> </w:t>
-      </w:r>
-      <w:r>
-        <w:rPr>
-          <w:i/>
-          <w:iCs/>
-        </w:rPr>
-        <w:t xml:space="preserve">Terms-of-trade booms: Saving-investment patterns and a new metric of income windfall</w:t>
-      </w:r>
-      <w:r>
-        <w:t xml:space="preserve"> </w:t>
-      </w:r>
-      <w:r>
-        <w:t xml:space="preserve">(capítulo del libro del FMI editado por Iakova et al.). Son dos versiones distintas: elegir la que respalda lo que se afirma.]</w:t>
-      </w:r>
-    </w:p>
-    <w:p>
-      <w:pPr>
-        <w:pStyle w:val="Compact"/>
-        <w:numPr>
-          <w:ilvl w:val="0"/>
-          <w:numId w:val="1002"/>
-        </w:numPr>
-      </w:pPr>
-      <w:r>
-        <w:t xml:space="preserve">Adler, G., y Sosa, S. (2014). [VERIFICAR: en</w:t>
-      </w:r>
-      <w:r>
-        <w:t xml:space="preserve"> </w:t>
-      </w:r>
-      <w:r>
-        <w:rPr>
-          <w:rStyle w:val="VerbatimChar"/>
-        </w:rPr>
-        <w:t xml:space="preserve">referencias.bib</w:t>
-      </w:r>
-      <w:r>
-        <w:t xml:space="preserve"> </w:t>
-      </w:r>
-      <w:r>
-        <w:t xml:space="preserve">figura</w:t>
-      </w:r>
-      <w:r>
-        <w:t xml:space="preserve"> </w:t>
-      </w:r>
-      <w:r>
-        <w:rPr>
-          <w:i/>
-          <w:iCs/>
-        </w:rPr>
-        <w:t xml:space="preserve">Global financial shocks and their transmission to emerging markets</w:t>
-      </w:r>
-      <w:r>
-        <w:t xml:space="preserve"> </w:t>
-      </w:r>
-      <w:r>
-        <w:t xml:space="preserve">(IMF Working Paper WP/14/72), y Santiago cita</w:t>
+        <w:t xml:space="preserve">Adler, G., Djigbenou, M.-L., y Sosa, S. (2016). Global financial shocks and foreign asset repatriation: Do local investors play a stabilizing role?</w:t>
+      </w:r>
+      <w:r>
+        <w:t xml:space="preserve"> </w:t>
+      </w:r>
+      <w:r>
+        <w:rPr>
+          <w:i/>
+          <w:iCs/>
+        </w:rPr>
+        <w:t xml:space="preserve">Journal of International Money and Finance</w:t>
+      </w:r>
+      <w:r>
+        <w:t xml:space="preserve">, 60, 8-28.</w:t>
+      </w:r>
+    </w:p>
+    <w:p>
+      <w:pPr>
+        <w:pStyle w:val="Compact"/>
+        <w:numPr>
+          <w:ilvl w:val="0"/>
+          <w:numId w:val="1002"/>
+        </w:numPr>
+      </w:pPr>
+      <w:r>
+        <w:t xml:space="preserve">Adler, G., y Sosa, S. (2013).</w:t>
       </w:r>
       <w:r>
         <w:t xml:space="preserve"> </w:t>
@@ -929,19 +864,7 @@
         <w:t xml:space="preserve"> </w:t>
       </w:r>
       <w:r>
-        <w:t xml:space="preserve">(capítulo del mismo libro del FMI). Son trabajos distintos. Hay que confirmar en cuál están el resultado de</w:t>
-      </w:r>
-      <w:r>
-        <w:t xml:space="preserve"> </w:t>
-      </w:r>
-      <w:r>
-        <w:t xml:space="preserve">“más de la mitad de la variabilidad de las entradas de capital”</w:t>
-      </w:r>
-      <w:r>
-        <w:t xml:space="preserve"> </w:t>
-      </w:r>
-      <w:r>
-        <w:t xml:space="preserve">y la asimetría argentina.]</w:t>
+        <w:t xml:space="preserve">(IMF Working Paper No. 13/27). Fondo Monetario Internacional.</w:t>
       </w:r>
     </w:p>
     <w:p>
@@ -966,7 +889,7 @@
         <w:t xml:space="preserve">Journal of Economic Dynamics and Control</w:t>
       </w:r>
       <w:r>
-        <w:t xml:space="preserve">, 170. [VERIFICAR número de artículo.]</w:t>
+        <w:t xml:space="preserve">, 170, artículo 104998. https://doi.org/10.1016/j.jedc.2024.104998</w:t>
       </w:r>
     </w:p>
     <w:p>
@@ -1097,7 +1020,7 @@
         <w:t xml:space="preserve"> </w:t>
       </w:r>
       <w:r>
-        <w:t xml:space="preserve">(ECB Occasional Paper No. 185). Banco Central Europeo. [VERIFICAR autores y que sostenga la absorción de la fatiga fiscal en los marcos europeos.]</w:t>
+        <w:t xml:space="preserve">(ECB Occasional Paper No. 185). Banco Central Europeo.</w:t>
       </w:r>
     </w:p>
     <w:p>
@@ -1246,38 +1169,7 @@
         </w:numPr>
       </w:pPr>
       <w:r>
-        <w:t xml:space="preserve">Cetrángolo, O., Damill, M., Frenkel, R., y Jiménez, J. P. (1997). [VERIFICAR: en</w:t>
-      </w:r>
-      <w:r>
-        <w:t xml:space="preserve"> </w:t>
-      </w:r>
-      <w:r>
-        <w:rPr>
-          <w:rStyle w:val="VerbatimChar"/>
-        </w:rPr>
-        <w:t xml:space="preserve">referencias.bib</w:t>
-      </w:r>
-      <w:r>
-        <w:t xml:space="preserve"> </w:t>
-      </w:r>
-      <w:r>
-        <w:t xml:space="preserve">figura</w:t>
-      </w:r>
-      <w:r>
-        <w:t xml:space="preserve"> </w:t>
-      </w:r>
-      <w:r>
-        <w:rPr>
-          <w:i/>
-          <w:iCs/>
-        </w:rPr>
-        <w:t xml:space="preserve">Sector público argentino: Ahorro, inversión y financiamiento (1975-1996)</w:t>
-      </w:r>
-      <w:r>
-        <w:t xml:space="preserve"> </w:t>
-      </w:r>
-      <w:r>
-        <w:t xml:space="preserve">(CEPAL, Oficina en Buenos Aires), y Santiago cita</w:t>
+        <w:t xml:space="preserve">Cetrángolo, O., Damill, M., Frenkel, R., y Jiménez, J. P. (1997).</w:t>
       </w:r>
       <w:r>
         <w:t xml:space="preserve"> </w:t>
@@ -1293,7 +1185,7 @@
         <w:t xml:space="preserve"> </w:t>
       </w:r>
       <w:r>
-        <w:t xml:space="preserve">(CEDES). Confirmar cuál es el documento descripto.]</w:t>
+        <w:t xml:space="preserve">(Documento de Trabajo R-315). Banco Interamericano de Desarrollo, Red de Centros de Investigación.</w:t>
       </w:r>
     </w:p>
     <w:p>
@@ -1474,31 +1366,7 @@
         <w:t xml:space="preserve"> </w:t>
       </w:r>
       <w:r>
-        <w:t xml:space="preserve">(IMF Country Report). [VERIFICAR número: Santiago cita 24/167;</w:t>
-      </w:r>
-      <w:r>
-        <w:t xml:space="preserve"> </w:t>
-      </w:r>
-      <w:r>
-        <w:rPr>
-          <w:rStyle w:val="VerbatimChar"/>
-        </w:rPr>
-        <w:t xml:space="preserve">referencias.bib</w:t>
-      </w:r>
-      <w:r>
-        <w:t xml:space="preserve"> </w:t>
-      </w:r>
-      <w:r>
-        <w:t xml:space="preserve">dice</w:t>
-      </w:r>
-      <w:r>
-        <w:t xml:space="preserve"> </w:t>
-      </w:r>
-      <w:r>
-        <w:t xml:space="preserve">“Eighth and Ninth Reviews”</w:t>
-      </w:r>
-      <w:r>
-        <w:t xml:space="preserve">.]</w:t>
+        <w:t xml:space="preserve">(IMF Country Report No. 24/167).</w:t>
       </w:r>
     </w:p>
     <w:p>
@@ -1644,31 +1512,6 @@
         </w:numPr>
       </w:pPr>
       <w:r>
-        <w:t xml:space="preserve">Klemm, A., Meier, A., y Sosa, S. (2014). Spillovers to Latin America from the normalization of U.S. monetary policy. En D. Iakova, L. M. Cubeddu, G. Adler y S. Sosa (Eds.),</w:t>
-      </w:r>
-      <w:r>
-        <w:t xml:space="preserve"> </w:t>
-      </w:r>
-      <w:r>
-        <w:rPr>
-          <w:i/>
-          <w:iCs/>
-        </w:rPr>
-        <w:t xml:space="preserve">Latin America: New challenges to growth and stability</w:t>
-      </w:r>
-      <w:r>
-        <w:t xml:space="preserve">. Fondo Monetario Internacional.</w:t>
-      </w:r>
-    </w:p>
-    <w:p>
-      <w:pPr>
-        <w:pStyle w:val="Compact"/>
-        <w:numPr>
-          <w:ilvl w:val="0"/>
-          <w:numId w:val="1002"/>
-        </w:numPr>
-      </w:pPr>
-      <w:r>
         <w:t xml:space="preserve">Levy Yeyati, E., y Sturzenegger, F. (2023). A balance-sheet approach to fiscal sustainability.</w:t>
       </w:r>
       <w:r>
@@ -1682,7 +1525,7 @@
         <w:t xml:space="preserve">Fiscal Studies</w:t>
       </w:r>
       <w:r>
-        <w:t xml:space="preserve">, 44(1), 61-84.</w:t>
+        <w:t xml:space="preserve">, 44(1), 61-84. https://doi.org/10.1111/1475-5890.12319</w:t>
       </w:r>
     </w:p>
     <w:p>
@@ -1746,20 +1589,20 @@
         </w:numPr>
       </w:pPr>
       <w:r>
-        <w:t xml:space="preserve">Mendoza, E. G., y Oviedo, P. M. (2007). Public debt, fiscal solvency and macroeconomic uncertainty in Latin America.</w:t>
-      </w:r>
-      <w:r>
-        <w:t xml:space="preserve"> </w:t>
-      </w:r>
-      <w:r>
-        <w:rPr>
-          <w:i/>
-          <w:iCs/>
-        </w:rPr>
-        <w:t xml:space="preserve">Economía</w:t>
-      </w:r>
-      <w:r>
-        <w:t xml:space="preserve">. [COMPLETAR volumen y páginas.]</w:t>
+        <w:t xml:space="preserve">Mendoza, E. G., y Oviedo, P. M. (2009). Public debt, fiscal solvency and macroeconomic uncertainty in Latin America: The cases of Brazil, Colombia, Costa Rica and Mexico.</w:t>
+      </w:r>
+      <w:r>
+        <w:t xml:space="preserve"> </w:t>
+      </w:r>
+      <w:r>
+        <w:rPr>
+          <w:i/>
+          <w:iCs/>
+        </w:rPr>
+        <w:t xml:space="preserve">Economía Mexicana. Nueva Época</w:t>
+      </w:r>
+      <w:r>
+        <w:t xml:space="preserve">, 18(2), 133-177.</w:t>
       </w:r>
     </w:p>
     <w:p>
@@ -1952,6 +1795,34 @@
         </w:numPr>
       </w:pPr>
       <w:r>
+        <w:t xml:space="preserve">Secretaría de Finanzas, Ministerio de Economía. (2025, 10 de diciembre).</w:t>
+      </w:r>
+      <w:r>
+        <w:t xml:space="preserve"> </w:t>
+      </w:r>
+      <w:r>
+        <w:rPr>
+          <w:i/>
+          <w:iCs/>
+        </w:rPr>
+        <w:t xml:space="preserve">Resultado de licitación del Bono del Tesoro Nacional en dólares estadounidenses 6,50% con vencimiento 30 de noviembre de 2029</w:t>
+      </w:r>
+      <w:r>
+        <w:t xml:space="preserve"> </w:t>
+      </w:r>
+      <w:r>
+        <w:t xml:space="preserve">[Comunicado]. https://www.argentina.gob.ar/noticias/resultado-de-licitacion-del-bono-del-tesoro-nacional-en-dolares-estadounidenses-650-con</w:t>
+      </w:r>
+    </w:p>
+    <w:p>
+      <w:pPr>
+        <w:pStyle w:val="Compact"/>
+        <w:numPr>
+          <w:ilvl w:val="0"/>
+          <w:numId w:val="1002"/>
+        </w:numPr>
+      </w:pPr>
+      <w:r>
         <w:t xml:space="preserve">Rigobon, R. (2003). Identification through heteroskedasticity.</w:t>
       </w:r>
       <w:r>
@@ -2108,32 +1979,7 @@
         </w:numPr>
       </w:pPr>
       <w:r>
-        <w:t xml:space="preserve">Wijayanti, R., y Rachmanira, S. (2020). [VERIFICAR: en</w:t>
-      </w:r>
-      <w:r>
-        <w:t xml:space="preserve"> </w:t>
-      </w:r>
-      <w:r>
-        <w:rPr>
-          <w:rStyle w:val="VerbatimChar"/>
-        </w:rPr>
-        <w:t xml:space="preserve">referencias.bib</w:t>
-      </w:r>
-      <w:r>
-        <w:t xml:space="preserve"> </w:t>
-      </w:r>
-      <w:r>
-        <w:t xml:space="preserve">figura como ponencia (</w:t>
-      </w:r>
-      <w:r>
-        <w:rPr>
-          <w:i/>
-          <w:iCs/>
-        </w:rPr>
-        <w:t xml:space="preserve">An early warning system for sovereign debt crisis in developing countries: A signal approach</w:t>
-      </w:r>
-      <w:r>
-        <w:t xml:space="preserve">, International Conference on Business, Economics, Social Sciences, and Humanities), y Santiago la cita como artículo en</w:t>
+        <w:t xml:space="preserve">Wijayanti, R., y Rachmanira, S. (2020). Early warning system for government debt crisis in developing countries.</w:t>
       </w:r>
       <w:r>
         <w:t xml:space="preserve"> </w:t>
@@ -2146,7 +1992,7 @@
         <w:t xml:space="preserve">Journal of Central Banking Theory and Practice</w:t>
       </w:r>
       <w:r>
-        <w:t xml:space="preserve">, 9 (número especial), 103-124. Confirmar cuál es.]</w:t>
+        <w:t xml:space="preserve">, 9(número especial), 103-124.</w:t>
       </w:r>
     </w:p>
     <w:p>
@@ -2644,13 +2490,13 @@
       </w:r>
     </w:p>
     <w:bookmarkEnd w:id="36"/>
-    <w:bookmarkStart w:id="37" w:name="nota-4.-pendientes-de-verificación"/>
+    <w:bookmarkStart w:id="37" w:name="nota-4.-pendientes"/>
     <w:p>
       <w:pPr>
         <w:pStyle w:val="Heading2"/>
       </w:pPr>
       <w:r>
-        <w:t xml:space="preserve">Nota 4. Pendientes de verificación</w:t>
+        <w:t xml:space="preserve">Nota 4. Pendientes</w:t>
       </w:r>
     </w:p>
     <w:p>
@@ -2662,7 +2508,19 @@
         </w:numPr>
       </w:pPr>
       <w:r>
-        <w:t xml:space="preserve">Si hubo emisión bajo ley de Nueva York en 2026.</w:t>
+        <w:t xml:space="preserve">Adler y Sosa: la versión de Santiago les atribuía un VAR global con un índice de precios netos de materias primas, que</w:t>
+      </w:r>
+      <w:r>
+        <w:t xml:space="preserve"> </w:t>
+      </w:r>
+      <w:r>
+        <w:t xml:space="preserve">“más de la mitad”</w:t>
+      </w:r>
+      <w:r>
+        <w:t xml:space="preserve"> </w:t>
+      </w:r>
+      <w:r>
+        <w:t xml:space="preserve">de la variabilidad de los flujos de capital responde a condiciones internacionales y una asimetría argentina. Nada de eso aparece en los trabajos de esos autores que se pudieron leer. El párrafo se reescribió con lo verificado. Si Santiago tiene la página de donde salió, se puede recuperar.</w:t>
       </w:r>
     </w:p>
     <w:p>
@@ -2674,91 +2532,7 @@
         </w:numPr>
       </w:pPr>
       <w:r>
-        <w:t xml:space="preserve">La fuente oficial de la colocación de diciembre de 2025.</w:t>
-      </w:r>
-    </w:p>
-    <w:p>
-      <w:pPr>
-        <w:pStyle w:val="Compact"/>
-        <w:numPr>
-          <w:ilvl w:val="0"/>
-          <w:numId w:val="1007"/>
-        </w:numPr>
-      </w:pPr>
-      <w:r>
-        <w:t xml:space="preserve">El nivel de los pasivos del BCRA a fines de 2025 en nuestra serie.</w:t>
-      </w:r>
-    </w:p>
-    <w:p>
-      <w:pPr>
-        <w:pStyle w:val="Compact"/>
-        <w:numPr>
-          <w:ilvl w:val="0"/>
-          <w:numId w:val="1007"/>
-        </w:numPr>
-      </w:pPr>
-      <w:r>
-        <w:t xml:space="preserve">Las cuatro referencias con dos versiones distintas: Adler y Sosa, Adler y Magud, Cetrángolo et al., y Wijayanti y Rachmanira.</w:t>
-      </w:r>
-    </w:p>
-    <w:p>
-      <w:pPr>
-        <w:pStyle w:val="Compact"/>
-        <w:numPr>
-          <w:ilvl w:val="0"/>
-          <w:numId w:val="1007"/>
-        </w:numPr>
-      </w:pPr>
-      <w:r>
-        <w:t xml:space="preserve">Bouabdallah et al. (2017).</w:t>
-      </w:r>
-    </w:p>
-    <w:p>
-      <w:pPr>
-        <w:pStyle w:val="Compact"/>
-        <w:numPr>
-          <w:ilvl w:val="0"/>
-          <w:numId w:val="1007"/>
-        </w:numPr>
-      </w:pPr>
-      <w:r>
-        <w:t xml:space="preserve">Las cifras de FMI (2024).</w:t>
-      </w:r>
-    </w:p>
-    <w:p>
-      <w:pPr>
-        <w:pStyle w:val="Compact"/>
-        <w:numPr>
-          <w:ilvl w:val="0"/>
-          <w:numId w:val="1007"/>
-        </w:numPr>
-      </w:pPr>
-      <w:r>
-        <w:t xml:space="preserve">Porto (2020) y Damill et al. (2015) para el párrafo del BCRA.</w:t>
-      </w:r>
-    </w:p>
-    <w:p>
-      <w:pPr>
-        <w:pStyle w:val="Compact"/>
-        <w:numPr>
-          <w:ilvl w:val="0"/>
-          <w:numId w:val="1007"/>
-        </w:numPr>
-      </w:pPr>
-      <w:r>
-        <w:t xml:space="preserve">Klemm et al. (2014).</w:t>
-      </w:r>
-    </w:p>
-    <w:p>
-      <w:pPr>
-        <w:pStyle w:val="Compact"/>
-        <w:numPr>
-          <w:ilvl w:val="0"/>
-          <w:numId w:val="1007"/>
-        </w:numPr>
-      </w:pPr>
-      <w:r>
-        <w:t xml:space="preserve">Levy Yeyati y Sturzenegger: confirmar que su VAR no incluye riesgo soberano.</w:t>
+        <w:t xml:space="preserve">Klemm et al. (2014) y Adler y Magud (2014) salieron del texto: no se pudo leer el capítulo de Klemm et al., y en Adler y Magud no está definido el índice que se les atribuía.</w:t>
       </w:r>
     </w:p>
     <w:bookmarkEnd w:id="37"/>

</xml_diff>